<commit_message>
Contract: monthly gross salary in point 2, vacation clause in point 3
Point 2 stated the estimated *annual* salary labelled "netto" — the
calculator's own term for "after employer social fees", which is what a payslip
calls gross. It now states "Den uppskattade månadslönen (fast + rörlig, brutto)"
using yearly.averageMonthly.

Point 3 (Anställningsvillkor) gains "NN har rätt till 25 dagars betald semester
per år."

Template rebuilt from the source docx; the modal's contract preview mirrors both
changes.

Co-Authored-By: Claude Opus 5 (1M context) <noreply@anthropic.com>
</commit_message>
<xml_diff>
--- a/templates/contract-template.docx
+++ b/templates/contract-template.docx
@@ -406,7 +406,7 @@
           <w:sz w:val="20"/>
           <w:lang w:eastAsia="sv-SE"/>
         </w:rPr>
-        <w:t xml:space="preserve"> års lönesamtal. Utöver detta har NN en rörlig lönedel om {{VARIABLE_PERCENTAGE}} % som beräknas enligt bifogad bilaga. Den uppskattade totala årslönen (fast + rörlig, netto) är {{ESTIMATED_TOTAL}} kr. (extra lön enligt nedan ej medräknat)</w:t>
+        <w:t xml:space="preserve"> års lönesamtal. Utöver detta har NN en rörlig lönedel om {{VARIABLE_PERCENTAGE}} % som beräknas enligt bifogad bilaga. Den uppskattade månadslönen (fast + rörlig, brutto) är {{ESTIMATED_MONTHLY}} kr. (extra lön enligt nedan ej medräknat)</w:t>
       </w:r>
     </w:p>
     <w:p>
@@ -662,6 +662,14 @@
           <w:lang w:eastAsia="sv-SE"/>
         </w:rPr>
         <w:t>.</w:t>
+      </w:r>
+      <w:r>
+        <w:rPr>
+          <w:rFonts w:asciiTheme="minorHAnsi" w:eastAsia="Times New Roman" w:hAnsiTheme="minorHAnsi" w:cstheme="minorHAnsi"/>
+          <w:sz w:val="20"/>
+          <w:lang w:eastAsia="sv-SE"/>
+        </w:rPr>
+        <w:t xml:space="preserve"> NN har rätt till 25 dagars betald semester per år.</w:t>
       </w:r>
     </w:p>
     <w:p>

</xml_diff>